<commit_message>
Añado la funcionalidad de poder ver los candidatos que han postulado a las vacantes creadas por las empresas
</commit_message>
<xml_diff>
--- a/docs/planificacion/Contexto_matchkey.docx
+++ b/docs/planificacion/Contexto_matchkey.docx
@@ -49,15 +49,15 @@
     </w:p>
     <w:p>
       <w:r>
-        <w:pict w14:anchorId="2C72C565">
-          <v:rect id="_x0000_i1188" style="width:0;height:1.5pt" o:hralign="center" o:hrstd="t" o:hr="t" fillcolor="#a0a0a0" stroked="f"/>
+        <w:pict w14:anchorId="5FEEE50D">
+          <v:rect id="_x0000_i1233" style="width:0;height:1.5pt" o:hralign="center" o:hrstd="t" o:hr="t" fillcolor="#a0a0a0" stroked="f"/>
         </w:pict>
       </w:r>
     </w:p>
     <w:p>
       <w:r>
-        <w:pict w14:anchorId="4A0B8E48">
-          <v:rect id="_x0000_i1189" style="width:0;height:1.5pt" o:hralign="center" o:hrstd="t" o:hr="t" fillcolor="#a0a0a0" stroked="f"/>
+        <w:pict w14:anchorId="6AD61862">
+          <v:rect id="_x0000_i1234" style="width:0;height:1.5pt" o:hralign="center" o:hrstd="t" o:hr="t" fillcolor="#a0a0a0" stroked="f"/>
         </w:pict>
       </w:r>
     </w:p>
@@ -111,8 +111,8 @@
     </w:p>
     <w:p>
       <w:r>
-        <w:pict w14:anchorId="385E2AC9">
-          <v:rect id="_x0000_i1190" style="width:0;height:1.5pt" o:hralign="center" o:hrstd="t" o:hr="t" fillcolor="#a0a0a0" stroked="f"/>
+        <w:pict w14:anchorId="327260B0">
+          <v:rect id="_x0000_i1235" style="width:0;height:1.5pt" o:hralign="center" o:hrstd="t" o:hr="t" fillcolor="#a0a0a0" stroked="f"/>
         </w:pict>
       </w:r>
     </w:p>
@@ -886,8 +886,8 @@
     </w:p>
     <w:p>
       <w:r>
-        <w:pict w14:anchorId="0F9C3791">
-          <v:rect id="_x0000_i1191" style="width:0;height:1.5pt" o:hralign="center" o:hrstd="t" o:hr="t" fillcolor="#a0a0a0" stroked="f"/>
+        <w:pict w14:anchorId="68F407CB">
+          <v:rect id="_x0000_i1236" style="width:0;height:1.5pt" o:hralign="center" o:hrstd="t" o:hr="t" fillcolor="#a0a0a0" stroked="f"/>
         </w:pict>
       </w:r>
     </w:p>
@@ -4830,8 +4830,8 @@
     </w:p>
     <w:p>
       <w:r>
-        <w:pict w14:anchorId="770C6148">
-          <v:rect id="_x0000_i1192" style="width:0;height:1.5pt" o:hralign="center" o:hrstd="t" o:hr="t" fillcolor="#a0a0a0" stroked="f"/>
+        <w:pict w14:anchorId="74DBD800">
+          <v:rect id="_x0000_i1237" style="width:0;height:1.5pt" o:hralign="center" o:hrstd="t" o:hr="t" fillcolor="#a0a0a0" stroked="f"/>
         </w:pict>
       </w:r>
     </w:p>
@@ -4853,8 +4853,8 @@
     </w:p>
     <w:p>
       <w:r>
-        <w:pict w14:anchorId="30FCFC6C">
-          <v:rect id="_x0000_i1193" style="width:0;height:1.5pt" o:hralign="center" o:hrstd="t" o:hr="t" fillcolor="#a0a0a0" stroked="f"/>
+        <w:pict w14:anchorId="30FA6F5D">
+          <v:rect id="_x0000_i1238" style="width:0;height:1.5pt" o:hralign="center" o:hrstd="t" o:hr="t" fillcolor="#a0a0a0" stroked="f"/>
         </w:pict>
       </w:r>
     </w:p>
@@ -6013,8 +6013,8 @@
     </w:p>
     <w:p>
       <w:r>
-        <w:pict w14:anchorId="746C790C">
-          <v:rect id="_x0000_i1194" style="width:0;height:1.5pt" o:hralign="center" o:hrstd="t" o:hr="t" fillcolor="#a0a0a0" stroked="f"/>
+        <w:pict w14:anchorId="128F03E7">
+          <v:rect id="_x0000_i1239" style="width:0;height:1.5pt" o:hralign="center" o:hrstd="t" o:hr="t" fillcolor="#a0a0a0" stroked="f"/>
         </w:pict>
       </w:r>
     </w:p>
@@ -7330,8 +7330,8 @@
     </w:p>
     <w:p>
       <w:r>
-        <w:pict w14:anchorId="006CBBF2">
-          <v:rect id="_x0000_i1195" style="width:0;height:1.5pt" o:hralign="center" o:hrstd="t" o:hr="t" fillcolor="#a0a0a0" stroked="f"/>
+        <w:pict w14:anchorId="1395627A">
+          <v:rect id="_x0000_i1240" style="width:0;height:1.5pt" o:hralign="center" o:hrstd="t" o:hr="t" fillcolor="#a0a0a0" stroked="f"/>
         </w:pict>
       </w:r>
     </w:p>
@@ -7438,8 +7438,8 @@
     </w:p>
     <w:p>
       <w:r>
-        <w:pict w14:anchorId="6672ECAF">
-          <v:rect id="_x0000_i1196" style="width:0;height:1.5pt" o:hralign="center" o:hrstd="t" o:hr="t" fillcolor="#a0a0a0" stroked="f"/>
+        <w:pict w14:anchorId="64EFA694">
+          <v:rect id="_x0000_i1241" style="width:0;height:1.5pt" o:hralign="center" o:hrstd="t" o:hr="t" fillcolor="#a0a0a0" stroked="f"/>
         </w:pict>
       </w:r>
     </w:p>
@@ -7469,8 +7469,8 @@
     </w:p>
     <w:p>
       <w:r>
-        <w:pict w14:anchorId="61EED123">
-          <v:rect id="_x0000_i1197" style="width:0;height:1.5pt" o:hralign="center" o:hrstd="t" o:hr="t" fillcolor="#a0a0a0" stroked="f"/>
+        <w:pict w14:anchorId="58D667D0">
+          <v:rect id="_x0000_i1242" style="width:0;height:1.5pt" o:hralign="center" o:hrstd="t" o:hr="t" fillcolor="#a0a0a0" stroked="f"/>
         </w:pict>
       </w:r>
     </w:p>
@@ -7525,8 +7525,8 @@
     </w:p>
     <w:p>
       <w:r>
-        <w:pict w14:anchorId="21DA0FAC">
-          <v:rect id="_x0000_i1198" style="width:0;height:1.5pt" o:hralign="center" o:hrstd="t" o:hr="t" fillcolor="#a0a0a0" stroked="f"/>
+        <w:pict w14:anchorId="34596D8E">
+          <v:rect id="_x0000_i1243" style="width:0;height:1.5pt" o:hralign="center" o:hrstd="t" o:hr="t" fillcolor="#a0a0a0" stroked="f"/>
         </w:pict>
       </w:r>
     </w:p>
@@ -7732,8 +7732,8 @@
     </w:p>
     <w:p>
       <w:r>
-        <w:pict w14:anchorId="4597F8CC">
-          <v:rect id="_x0000_i1199" style="width:0;height:1.5pt" o:hralign="center" o:hrstd="t" o:hr="t" fillcolor="#a0a0a0" stroked="f"/>
+        <w:pict w14:anchorId="65CCB601">
+          <v:rect id="_x0000_i1244" style="width:0;height:1.5pt" o:hralign="center" o:hrstd="t" o:hr="t" fillcolor="#a0a0a0" stroked="f"/>
         </w:pict>
       </w:r>
     </w:p>
@@ -7771,8 +7771,8 @@
     </w:p>
     <w:p>
       <w:r>
-        <w:pict w14:anchorId="7230969A">
-          <v:rect id="_x0000_i1200" style="width:0;height:1.5pt" o:hralign="center" o:hrstd="t" o:hr="t" fillcolor="#a0a0a0" stroked="f"/>
+        <w:pict w14:anchorId="796F20E6">
+          <v:rect id="_x0000_i1245" style="width:0;height:1.5pt" o:hralign="center" o:hrstd="t" o:hr="t" fillcolor="#a0a0a0" stroked="f"/>
         </w:pict>
       </w:r>
     </w:p>
@@ -7946,8 +7946,8 @@
     </w:p>
     <w:p>
       <w:r>
-        <w:pict w14:anchorId="4D0E92BF">
-          <v:rect id="_x0000_i1201" style="width:0;height:1.5pt" o:hralign="center" o:hrstd="t" o:hr="t" fillcolor="#a0a0a0" stroked="f"/>
+        <w:pict w14:anchorId="374DFDE8">
+          <v:rect id="_x0000_i1246" style="width:0;height:1.5pt" o:hralign="center" o:hrstd="t" o:hr="t" fillcolor="#a0a0a0" stroked="f"/>
         </w:pict>
       </w:r>
     </w:p>
@@ -8374,8 +8374,8 @@
     </w:p>
     <w:p>
       <w:r>
-        <w:pict w14:anchorId="43208C84">
-          <v:rect id="_x0000_i1202" style="width:0;height:1.5pt" o:hralign="center" o:hrstd="t" o:hr="t" fillcolor="#a0a0a0" stroked="f"/>
+        <w:pict w14:anchorId="46128BEA">
+          <v:rect id="_x0000_i1247" style="width:0;height:1.5pt" o:hralign="center" o:hrstd="t" o:hr="t" fillcolor="#a0a0a0" stroked="f"/>
         </w:pict>
       </w:r>
     </w:p>
@@ -8455,6 +8455,13 @@
       <w:r>
         <w:t xml:space="preserve"> → pégalo.</w:t>
       </w:r>
+    </w:p>
+    <w:p>
+      <w:pPr>
+        <w:rPr>
+          <w:u w:val="single"/>
+        </w:rPr>
+      </w:pPr>
     </w:p>
     <w:p>
       <w:pPr>
@@ -11750,7 +11757,7 @@
   <w:style w:type="paragraph" w:default="1" w:styleId="Normal">
     <w:name w:val="Normal"/>
     <w:qFormat/>
-    <w:rsid w:val="005A7917"/>
+    <w:rsid w:val="005E2B40"/>
   </w:style>
   <w:style w:type="paragraph" w:styleId="Ttulo1">
     <w:name w:val="heading 1"/>

</xml_diff>